<commit_message>
Add scope-escalation clause to advisory agreement
Adds the clarification Shalewa asked for before signing: any material
increase in scope or time commitment, including operational or
executional responsibilities, requires mutual agreement and a separate
written arrangement, and nothing of that kind falls under this letter.

Co-Authored-By: Claude Opus 5 <noreply@anthropic.com>
Claude-Session: https://claude.ai/code/session_01GNbbVsqnhZZujrxG7KqZEw
</commit_message>
<xml_diff>
--- a/docs/Advisory-Agreement-Omoshalewa-Sheu.docx
+++ b/docs/Advisory-Agreement-Omoshalewa-Sheu.docx
@@ -509,6 +509,29 @@
     </w:p>
     <w:p>
       <w:pPr>
+        <w:spacing w:after="160" w:line="276"/>
+      </w:pPr>
+      <w:r>
+        <w:rPr>
+          <w:rFonts w:ascii="Calibri" w:cs="Calibri" w:eastAsia="Calibri" w:hAnsi="Calibri"/>
+          <w:b/>
+          <w:bCs/>
+          <w:sz w:val="22"/>
+          <w:szCs w:val="22"/>
+        </w:rPr>
+        <w:t xml:space="preserve">Any material increase in the scope or time commitment of your involvement, including any operational or executional responsibilities, shall be subject to mutual agreement and, where appropriate, a separate written arrangement.</w:t>
+      </w:r>
+      <w:r>
+        <w:rPr>
+          <w:rFonts w:ascii="Calibri" w:cs="Calibri" w:eastAsia="Calibri" w:hAnsi="Calibri"/>
+          <w:sz w:val="22"/>
+          <w:szCs w:val="22"/>
+        </w:rPr>
+        <w:t xml:space="preserve"> For the avoidance of doubt, nothing of that kind falls within this letter, and you are under no obligation to take on any such responsibility.</w:t>
+      </w:r>
+    </w:p>
+    <w:p>
+      <w:pPr>
         <w:pStyle w:val="Heading2"/>
         <w:spacing w:after="100" w:line="276"/>
       </w:pPr>

</xml_diff>